<commit_message>
Baklaborant javoblari: barcha 153 mavzu to'liq (001-153)
- Har bir mavzu alohida .docx fayl, 800-950 so'z oralig'ida
- O'zbek tili, lotin yozuvi, oddiy apostrof
- Numbering konfiguratsiyasi bilan ro'yxatlar
- Haqiqiy manbalar: WHO, CDC, Bailey&Scott, Leber CMPH (DOI), Murray, Mahon, Koneman
- O'zbekiston hujjatlari: xayrullokomilov.uz kutubxona (tekshirilgan URL)
</commit_message>
<xml_diff>
--- a/natija/001.docx
+++ b/natija/001.docx
@@ -285,7 +285,7 @@
         <w:spacing w:after="80" w:line="260"/>
       </w:pPr>
       <w:r>
-        <w:t xml:space="preserve">4. Oʻzbekiston Respublikasi Sogʻliqni saqlash vazirligi. «Bakteriologiya laboratoriyasi nizomi». URL: https://xayrullokomilov.uz/kutubxona/244</w:t>
+        <w:t xml:space="preserve">4. O'zbekiston Respublikasi Sog'liqni saqlash vazirligi. «Bakteriologiya laboratoriyasi nizomi». URL: https://xayrullokomilov.uz/kutubxona/244</w:t>
       </w:r>
     </w:p>
     <w:p>
@@ -293,7 +293,7 @@
         <w:spacing w:after="80" w:line="260"/>
       </w:pPr>
       <w:r>
-        <w:t xml:space="preserve">5. SanQvaN 0090-25-son. Dezinfeksiya tadbirlarini oʻtkazish, dezinfeksiya xizmatini amalga oshiruvchi tashkilotlarni joylashtirish hamda ularning xonalari va jihozlariga oid sanitariya qoidalari, normalari va gigiyena normativlari. Toshkent; 2025. URL: https://xayrullokomilov.uz/kutubxona/660</w:t>
+        <w:t xml:space="preserve">5. SanQvaN 0090-25-son. Dezinfeksiya tadbirlarini o'tkazish, dezinfeksiya xizmatini amalga oshiruvchi tashkilotlarni joylashtirish hamda ularning xonalari va jihozlariga oid sanitariya qoidalari, normalari va gigiyena normativlari. Toshkent; 2025. URL: https://xayrullokomilov.uz/kutubxona/660</w:t>
       </w:r>
     </w:p>
     <w:sectPr>

</xml_diff>